<commit_message>
Pro version: explain the learned-helplessness experiment properly
Drops the lead-in line; tells the 1967 dog experiment step by step
(controllable vs. uncontrollable shock, the low-barrier box) and the
2016 reversal (passivity is the default, control is what is learned).
Reference entry expanded with the 1967 and 2016 citations.

Co-Authored-By: Claude Fable 5.1 <noreply@anthropic.com>
Claude-Session: https://claude.ai/code/session_01QdVJcefjKXQoLjgyoNP2jG
</commit_message>
<xml_diff>
--- a/exports/לתכנת-את-המוח-גרסה-מקצועית-לעריכה.docx
+++ b/exports/לתכנת-את-המוח-גרסה-מקצועית-לעריכה.docx
@@ -677,21 +677,63 @@
           <w:rFonts w:ascii="Arial" w:cs="Arial" w:hAnsi="Arial"/>
           <w:rtl/>
         </w:rPr>
-        <w:t xml:space="preserve">ועכשיו, הדבר שהכי שינה לי את ההסתכלות.</w:t>
-      </w:r>
-    </w:p>
-    <w:p>
-      <w:pPr>
-        <w:bidi/>
-        <w:spacing w:after="160" w:line="360"/>
-        <w:jc w:val="both"/>
-      </w:pPr>
-      <w:r>
-        <w:rPr>
-          <w:rFonts w:ascii="Arial" w:cs="Arial" w:hAnsi="Arial"/>
-          <w:rtl/>
-        </w:rPr>
-        <w:t xml:space="preserve">לפני כמעט שישים שנה, שני חוקרים, סליגמן ומאייר, גילו תופעה שהם קראו לה "חוסר אונים נלמד". בעלי חיים שלמדו שמה שהם עושים לא משנה כלום, הפסיקו לנסות. גם כשכבר יכלו פשוט לצאת. חמישים שנה אחר כך, הם חזרו לאותו מחקר, והפכו את המסקנה. חוסר האונים בכלל לא נלמד. הוא ברירת המחדל של המוח. מה שצריך ללמוד, זה שיש לנו שליטה.</w:t>
+        <w:t xml:space="preserve">לפני כמעט שישים שנה, שני חוקרים צעירים, מרטין סליגמן וסטיבן מאייר, עשו ניסוי בכלבים. הם חילקו אותם לקבוצות. קבוצה אחת קיבלה שוקים חשמליים קלים, ויכלה להפסיק אותם בלחיצה על לוח. קבוצה שנייה קיבלה בדיוק את אותם השוקים, אבל שום דבר שהיא עשתה לא עזר. השוק נגמר מתי שהוא נגמר.</w:t>
+      </w:r>
+    </w:p>
+    <w:p>
+      <w:pPr>
+        <w:bidi/>
+        <w:spacing w:after="160" w:line="360"/>
+        <w:jc w:val="both"/>
+      </w:pPr>
+      <w:r>
+        <w:rPr>
+          <w:rFonts w:ascii="Arial" w:cs="Arial" w:hAnsi="Arial"/>
+          <w:rtl/>
+        </w:rPr>
+        <w:t xml:space="preserve">ואז הגיע השלב השני. שמו את כל הכלבים בתא עם מחיצה נמוכה. שוק קל, ומספיק לקפוץ מעל המחיצה כדי להפסיק אותו. הכלבים מהקבוצה הראשונה, אלה שלמדו שיש להם שליטה, קפצו תוך שניות. והכלבים מהקבוצה השנייה? רובם פשוט נשכבו. לא ניסו. למרות שהיציאה הייתה שם, מטר אחד מהם.</w:t>
+      </w:r>
+    </w:p>
+    <w:p>
+      <w:pPr>
+        <w:bidi/>
+        <w:spacing w:after="160" w:line="360"/>
+        <w:jc w:val="both"/>
+      </w:pPr>
+      <w:r>
+        <w:rPr>
+          <w:rFonts w:ascii="Arial" w:cs="Arial" w:hAnsi="Arial"/>
+          <w:rtl/>
+        </w:rPr>
+        <w:t xml:space="preserve">הם קראו לזה "חוסר אונים נלמד". והמסקנה הייתה ברורה: אם למדת שמה שאתה עושה לא משנה, אתה מפסיק לנסות. גם כשכבר אפשר לצאת.</w:t>
+      </w:r>
+    </w:p>
+    <w:p>
+      <w:pPr>
+        <w:bidi/>
+        <w:spacing w:after="160" w:line="360"/>
+        <w:jc w:val="both"/>
+      </w:pPr>
+      <w:r>
+        <w:rPr>
+          <w:rFonts w:ascii="Arial" w:cs="Arial" w:hAnsi="Arial"/>
+          <w:rtl/>
+        </w:rPr>
+        <w:t xml:space="preserve">ואז, חמישים שנה אחר כך, אותם שני חוקרים חזרו לאותו ניסוי. עם כלים שלא היו להם אז, כלים שרואים מה קורה בתוך המוח. והם הפכו את המסקנה של עצמם. הכלבים לא למדו להיות חסרי אונים. הפסיביות היא התגובה האוטומטית של המוח למשהו רע שאי אפשר לשלוט בו. היא מגיעה מברירת המחדל. מה שהכלבים מהקבוצה הראשונה למדו, זה ההפך: שיש להם שליטה. וזה מה שהדליק במוח שלהם את האזור שמשתיק את הוויתור.</w:t>
+      </w:r>
+    </w:p>
+    <w:p>
+      <w:pPr>
+        <w:bidi/>
+        <w:spacing w:after="160" w:line="360"/>
+        <w:jc w:val="both"/>
+      </w:pPr>
+      <w:r>
+        <w:rPr>
+          <w:rFonts w:ascii="Arial" w:cs="Arial" w:hAnsi="Arial"/>
+          <w:rtl/>
+        </w:rPr>
+        <w:t xml:space="preserve">כלומר, חוסר האונים לא נלמד. השליטה נלמדת.</w:t>
       </w:r>
     </w:p>
     <w:p>

</xml_diff>